<commit_message>
Polish: craft affordability, altar tone wired, DESIGN_INTENT.docx (wall-vs-altar focus), BUILD_LOG.md updated
</commit_message>
<xml_diff>
--- a/DESIGN_INTENT.docx
+++ b/DESIGN_INTENT.docx
@@ -17,12 +17,18 @@
         <w:pStyle w:val="Heading2"/>
       </w:pPr>
       <w:r>
-        <w:t xml:space="preserve">Concept</w:t>
-      </w:r>
-    </w:p>
-    <w:p>
-      <w:r>
-        <w:t xml:space="preserve">Solar Siege is a tower-defense game built on the legend of Archimedes defending Syracuse with focused sunlight. A single sun beam enters from the top of the screen. The player positions mirrors and prisms to split, redirect, and concentrate light onto enemy ships descending from above, while also powering altar zones below the city wall to generate the resources needed for upgrades.</w:t>
+        <w:t xml:space="preserve">Core Tension</w:t>
+      </w:r>
+    </w:p>
+    <w:p>
+      <w:r>
+        <w:t xml:space="preserve">Solar Siege is a tower-defence game built on the legend of Archimedes defending Syracuse with focused sunlight. A single beam of light descends from the sun. The player splits it through a prism, then aims the resulting bands with mirrors to burn approaching warships. The raw sun beam is inert — a resource to be captured, not a weapon. Only light that has passed through the prism can deal damage or generate income.</w:t>
+      </w:r>
+    </w:p>
+    <w:p/>
+    <w:p>
+      <w:r>
+        <w:t xml:space="preserve">The central trade-off is attention allocation between two mutually exclusive uses of the same light. Beams aimed upward into the ship lanes destroy enemies and protect the city wall. Beams aimed downward onto altar zones generate the currencies needed for upgrades. No single beam path can serve both purposes simultaneously, because the prism sits between the ship lanes and the altar field. Every mirror the player rotates toward defence is a mirror not earning income, and vice versa.</w:t>
       </w:r>
     </w:p>
     <w:p/>
@@ -31,12 +37,18 @@
         <w:pStyle w:val="Heading2"/>
       </w:pPr>
       <w:r>
-        <w:t xml:space="preserve">Core Loop</w:t>
-      </w:r>
-    </w:p>
-    <w:p>
-      <w:r>
-        <w:t xml:space="preserve">The fundamental tension is attention allocation. Beams aimed upward destroy enemies; beams aimed downward power altars for income. No single beam path can serve both purposes simultaneously, so the player constantly trades short-term survival against long-term economy. Mirrors can be set and left (the intended steady state for routine traffic), freeing the player to manage altars and craft upgrades, but elite enemies and multi-lane waves require active repositioning.</w:t>
+        <w:t xml:space="preserve">Economy</w:t>
+      </w:r>
+    </w:p>
+    <w:p>
+      <w:r>
+        <w:t xml:space="preserve">Four altar zones (brass, bronze, silver, gold) sit below the city wall. Each produces a small passive trickle, but 80% of its output requires an active beam held on it. Continuous illumination triggers overheat after six seconds, halving efficiency until a ten-second cooldown completes. This prevents the degenerate strategy of parking a beam and forgetting it — the player must pulse beams across altars in rhythm while monitoring the battlefield above.</w:t>
+      </w:r>
+    </w:p>
+    <w:p/>
+    <w:p>
+      <w:r>
+        <w:t xml:space="preserve">Kill rewards provide supplementary income so the game never fully stalls if all beams are committed to defence. Upgrades (additional mirrors, higher prism tiers, priests for faith generation) cost specific currencies, creating a progression ladder that rewards balancing all four altar types rather than camping one.</w:t>
       </w:r>
     </w:p>
     <w:p/>
@@ -45,12 +57,18 @@
         <w:pStyle w:val="Heading2"/>
       </w:pPr>
       <w:r>
-        <w:t xml:space="preserve">Optics System</w:t>
-      </w:r>
-    </w:p>
-    <w:p>
-      <w:r>
-        <w:t xml:space="preserve">The beam solver traces rays through a mirror-and-prism network each frame. Mirrors reflect; prisms split a beam into N sub-rays (configurable from 3 to 6 bands via tiered upgrades). Sub-rays carry reduced damage but enable area coverage. A synergy bonus rewards focusing multiple beams onto one target, scaled inversely with prism tier so that focused DPS remains constant regardless of how many bands exist. Heat accumulates on enemies under sustained fire and decays when the beam moves away, creating a skill reward for tracking.</w:t>
+        <w:t xml:space="preserve">Optics as Gameplay</w:t>
+      </w:r>
+    </w:p>
+    <w:p>
+      <w:r>
+        <w:t xml:space="preserve">The beam solver traces rays through a mirror-and-prism network each frame. Mirrors reflect; the prism splits the white beam into coloured bands whose count increases with tier (3 to 6). A synergy bonus rewards focusing multiple bands onto one target, scaled inversely with tier so that concentrated DPS remains constant regardless of band count. Heat accumulates on enemies under sustained fire and decays when the beam leaves, rewarding precise tracking over sweeping.</w:t>
+      </w:r>
+    </w:p>
+    <w:p/>
+    <w:p>
+      <w:r>
+        <w:t xml:space="preserve">Mirrors start vertical and inert. The player must actively rotate them to direct light into ship lanes. Without interaction, zero kills occur and the wall falls quickly. The intended steady state is to set flank mirrors on routine traffic, then spend freed attention cycling altars and managing priority targets. This creates a rhythm of setup, maintenance, and crisis response that scales with wave intensity.</w:t>
       </w:r>
     </w:p>
     <w:p/>
@@ -59,40 +77,12 @@
         <w:pStyle w:val="Heading2"/>
       </w:pPr>
       <w:r>
-        <w:t xml:space="preserve">Economy</w:t>
-      </w:r>
-    </w:p>
-    <w:p>
-      <w:r>
-        <w:t xml:space="preserve">Four currencies (brass, bronze, silver, gold) map to four altar zones. Each altar produces 20% of its rate passively and 80% only while a beam is held on it. Continuous illumination triggers overheat after six seconds, halving output until a ten-second cooldown completes. This discourages leaving a beam parked permanently and creates micro-management rhythm. Kill rewards provide supplementary income, preventing total stall if all beams are needed for defence.</w:t>
-      </w:r>
-    </w:p>
-    <w:p/>
-    <w:p>
-      <w:pPr>
-        <w:pStyle w:val="Heading2"/>
-      </w:pPr>
-      <w:r>
-        <w:t xml:space="preserve">Visual Language</w:t>
-      </w:r>
-    </w:p>
-    <w:p>
-      <w:r>
-        <w:t xml:space="preserve">Unlit altars pulse gently with a coloured glow ring to attract attention. When beam-powered, they emit a steady metal-coloured glow. An arc indicator wraps around each altar showing heat buildup, transitioning green to yellow to red. Craft buttons highlight with a brief pulse when they become affordable. Enemy ships flash white on hit and fragment into debris on destruction. The beam itself pulses with a subtle amplitude to suggest energy flow.</w:t>
-      </w:r>
-    </w:p>
-    <w:p/>
-    <w:p>
-      <w:pPr>
-        <w:pStyle w:val="Heading2"/>
-      </w:pPr>
-      <w:r>
-        <w:t xml:space="preserve">Technical Constraints</w:t>
-      </w:r>
-    </w:p>
-    <w:p>
-      <w:r>
-        <w:t xml:space="preserve">The build is a single index.html under 35 MB with Three.js vendored, zero network requests, and full offline functionality from file:// protocol. Audio is synthesized at runtime via WebAudio (no audio assets). An optional intro video (H.264 Baseline 3.1, fast-start) plays on supported devices with a canplaythrough gate and four-second timeout fallback. A five-second failsafe guarantees gameplay is always reachable regardless of video or rendering failures. The game targets mobile portrait orientation with touch-drag mirror control.</w:t>
+        <w:t xml:space="preserve">Technical Frame</w:t>
+      </w:r>
+    </w:p>
+    <w:p>
+      <w:r>
+        <w:t xml:space="preserve">The build is a single index.html with Three.js vendored, zero network requests, and full offline play from file:// protocol. Audio is synthesized at runtime via WebAudio. An optional intro cinematic plays on supported devices with graceful fallback. A defeat cinematic plays once on first loss, skippable from the first frame. Total package size is under 3 MB.</w:t>
       </w:r>
     </w:p>
     <w:sectPr>

</xml_diff>